<commit_message>
A&E PI: plainer wording of the NSW retroactive date rule
Co-Authored-By: Claude Opus 5.5 <noreply@anthropic.com>
Claude-Session: https://claude.ai/code/session_013jQuKLkqWzmefkpkRz1sNQ
</commit_message>
<xml_diff>
--- a/wordings/downloads/Meridian_PI_Architects_Engineers_Endorsement_v1.0.0-DRAFT.docx
+++ b/wordings/downloads/Meridian_PI_Architects_Engineers_Endorsement_v1.0.0-DRAFT.docx
@@ -485,23 +485,7 @@
           <w:b w:val="0"/>
           <w:i w:val="0"/>
         </w:rPr>
-        <w:t xml:space="preserve">For a claim arising from work that the Act requires you to be registered to carry out, </w:t>
-      </w:r>
-      <w:hyperlink w:anchor="c_pi_def_retroactive_date">
-        <w:r>
-          <w:rPr>
-            <w:color w:val="2E5C4E"/>
-            <w:u w:val="single"/>
-          </w:rPr>
-          <w:t xml:space="preserve">the definition of Retroactive date</w:t>
-        </w:r>
-      </w:hyperlink>
-      <w:r>
-        <w:rPr>
-          <w:b w:val="0"/>
-          <w:i w:val="0"/>
-        </w:rPr>
-        <w:t xml:space="preserve"> is replaced by the date you were first registered under that Act, if that date is earlier than the retroactive date shown in the schedule.</w:t>
+        <w:t>For a claim arising from work that the Act requires you to be registered to carry out, the retroactive date is the date you were first registered under that Act, if that date is earlier than the retroactive date shown in the schedule.</w:t>
       </w:r>
     </w:p>
     <w:p>

</xml_diff>